<commit_message>
requerimientos 4 y 5 parcial documentados
</commit_message>
<xml_diff>
--- a/Docs/ISIS1225 - AnalisisReto-TEMPLATE RETO.docx
+++ b/Docs/ISIS1225 - AnalisisReto-TEMPLATE RETO.docx
@@ -185,10 +185,7 @@
           </w:tcPr>
           <w:p>
             <w:r>
-              <w:t>Parámetros</w:t>
-            </w:r>
-            <w:r>
-              <w:t xml:space="preserve"> necesarios para resolver el requerimiento.</w:t>
+              <w:t>Catalog, producto</w:t>
             </w:r>
           </w:p>
         </w:tc>
@@ -226,8 +223,115 @@
             <w:tcW w:w="6300" w:type="dxa"/>
           </w:tcPr>
           <w:p>
-            <w:r>
-              <w:t>Respuesta esperada del algoritmo.</w:t>
+            <w:pPr>
+              <w:pStyle w:val="Prrafodelista"/>
+              <w:numPr>
+                <w:ilvl w:val="0"/>
+                <w:numId w:val="2"/>
+              </w:numPr>
+            </w:pPr>
+            <w:r>
+              <w:t>Tiempo de ejecución en MS</w:t>
+            </w:r>
+          </w:p>
+          <w:p>
+            <w:pPr>
+              <w:pStyle w:val="Prrafodelista"/>
+              <w:numPr>
+                <w:ilvl w:val="0"/>
+                <w:numId w:val="2"/>
+              </w:numPr>
+              <w:rPr>
+                <w:i/>
+                <w:iCs/>
+              </w:rPr>
+            </w:pPr>
+            <w:r>
+              <w:t>Número total de pedidos del producto ingresado como parámetro</w:t>
+            </w:r>
+          </w:p>
+          <w:p>
+            <w:pPr>
+              <w:pStyle w:val="Prrafodelista"/>
+              <w:numPr>
+                <w:ilvl w:val="0"/>
+                <w:numId w:val="2"/>
+              </w:numPr>
+            </w:pPr>
+            <w:r>
+              <w:t>Promedio de Price_per_Box, precio más alto, precio más bajo.</w:t>
+            </w:r>
+          </w:p>
+          <w:p>
+            <w:pPr>
+              <w:pStyle w:val="Prrafodelista"/>
+              <w:numPr>
+                <w:ilvl w:val="0"/>
+                <w:numId w:val="2"/>
+              </w:numPr>
+            </w:pPr>
+            <w:r>
+              <w:t>Promedio de Discount_Pct, menor descuento y mayor descuento.</w:t>
+            </w:r>
+          </w:p>
+          <w:p>
+            <w:pPr>
+              <w:pStyle w:val="Prrafodelista"/>
+              <w:numPr>
+                <w:ilvl w:val="0"/>
+                <w:numId w:val="2"/>
+              </w:numPr>
+            </w:pPr>
+            <w:r>
+              <w:t>Promedio de Boxes_Shipped, menor y mayor número de cajas.</w:t>
+            </w:r>
+          </w:p>
+          <w:p>
+            <w:pPr>
+              <w:pStyle w:val="Prrafodelista"/>
+              <w:numPr>
+                <w:ilvl w:val="0"/>
+                <w:numId w:val="2"/>
+              </w:numPr>
+            </w:pPr>
+            <w:r>
+              <w:t>Promedio de Marketing_Spend, menor y mayor inversión en mercadeo.</w:t>
+            </w:r>
+          </w:p>
+          <w:p>
+            <w:pPr>
+              <w:pStyle w:val="Prrafodelista"/>
+              <w:numPr>
+                <w:ilvl w:val="0"/>
+                <w:numId w:val="2"/>
+              </w:numPr>
+            </w:pPr>
+            <w:r>
+              <w:t>Año con más pedidos (a partir de Order_Date).</w:t>
+            </w:r>
+          </w:p>
+          <w:p>
+            <w:pPr>
+              <w:pStyle w:val="Prrafodelista"/>
+              <w:numPr>
+                <w:ilvl w:val="0"/>
+                <w:numId w:val="2"/>
+              </w:numPr>
+            </w:pPr>
+            <w:r>
+              <w:t>El pedido del producto de mayor Amount, indicando su Amount respectivo. Informar también Order_ID, Country, Order_Date y Price_per_Box.</w:t>
+            </w:r>
+          </w:p>
+          <w:p>
+            <w:pPr>
+              <w:pStyle w:val="Prrafodelista"/>
+              <w:numPr>
+                <w:ilvl w:val="0"/>
+                <w:numId w:val="2"/>
+              </w:numPr>
+            </w:pPr>
+            <w:r>
+              <w:t>El pedido de menor Amount dentro del producto, indicando su Amount respectivo. Informar también Order_ID, Country, Order_Date y Price_per_Box.</w:t>
             </w:r>
           </w:p>
         </w:tc>
@@ -259,13 +363,7 @@
           </w:tcPr>
           <w:p>
             <w:r>
-              <w:t xml:space="preserve">Si se </w:t>
-            </w:r>
-            <w:r>
-              <w:t>implementó</w:t>
-            </w:r>
-            <w:r>
-              <w:t xml:space="preserve"> y quien lo hizo.</w:t>
+              <w:t>Sí, implementado por Juan Lesmes - 202614029</w:t>
             </w:r>
           </w:p>
         </w:tc>
@@ -359,7 +457,7 @@
           </w:tcPr>
           <w:p>
             <w:r>
-              <w:t>Paso 1</w:t>
+              <w:t>Paso 1: Empezar el tiempo de ejecución.</w:t>
             </w:r>
           </w:p>
         </w:tc>
@@ -369,7 +467,7 @@
           </w:tcPr>
           <w:p>
             <w:r>
-              <w:t>O(...)</w:t>
+              <w:t>O(1)</w:t>
             </w:r>
           </w:p>
         </w:tc>
@@ -381,7 +479,7 @@
           </w:tcPr>
           <w:p>
             <w:r>
-              <w:t xml:space="preserve">Paso 2 </w:t>
+              <w:t>Paso 2: Indexación al catálogo de órdenes.</w:t>
             </w:r>
           </w:p>
         </w:tc>
@@ -403,13 +501,25 @@
           </w:tcPr>
           <w:p>
             <w:r>
-              <w:t>Paso</w:t>
-            </w:r>
-            <w:proofErr w:type="gramStart"/>
-            <w:r>
-              <w:t xml:space="preserve"> ….</w:t>
-            </w:r>
-            <w:proofErr w:type="gramEnd"/>
+              <w:t xml:space="preserve">Paso 3: Creación de </w:t>
+            </w:r>
+            <w:r>
+              <w:rPr>
+                <w:i/>
+                <w:iCs/>
+              </w:rPr>
+              <w:t xml:space="preserve">single_linked_list </w:t>
+            </w:r>
+            <w:r>
+              <w:t xml:space="preserve">y acceso a </w:t>
+            </w:r>
+            <w:r>
+              <w:rPr>
+                <w:i/>
+                <w:iCs/>
+              </w:rPr>
+              <w:t>size</w:t>
+            </w:r>
           </w:p>
         </w:tc>
         <w:tc>
@@ -421,6 +531,163 @@
               <w:t>O(...)</w:t>
             </w:r>
           </w:p>
+        </w:tc>
+      </w:tr>
+      <w:tr>
+        <w:trPr>
+          <w:trHeight w:val="300"/>
+        </w:trPr>
+        <w:tc>
+          <w:tcPr>
+            <w:tcW w:w="5070" w:type="dxa"/>
+          </w:tcPr>
+          <w:p>
+            <w:r>
+              <w:t>Paso 4: Recorrido a cada una de las órdenes.</w:t>
+            </w:r>
+          </w:p>
+          <w:p/>
+        </w:tc>
+        <w:tc>
+          <w:tcPr>
+            <w:tcW w:w="4275" w:type="dxa"/>
+          </w:tcPr>
+          <w:p>
+            <w:r>
+              <w:t>O(...)</w:t>
+            </w:r>
+          </w:p>
+        </w:tc>
+      </w:tr>
+      <w:tr>
+        <w:trPr>
+          <w:trHeight w:val="300"/>
+        </w:trPr>
+        <w:tc>
+          <w:tcPr>
+            <w:tcW w:w="5070" w:type="dxa"/>
+          </w:tcPr>
+          <w:p>
+            <w:r>
+              <w:t>Paso 5: Comparación a la variable product del registro recorrido con el producto ingresado como parámetro</w:t>
+            </w:r>
+          </w:p>
+        </w:tc>
+        <w:tc>
+          <w:tcPr>
+            <w:tcW w:w="4275" w:type="dxa"/>
+          </w:tcPr>
+          <w:p/>
+        </w:tc>
+      </w:tr>
+      <w:tr>
+        <w:trPr>
+          <w:trHeight w:val="300"/>
+        </w:trPr>
+        <w:tc>
+          <w:tcPr>
+            <w:tcW w:w="5070" w:type="dxa"/>
+          </w:tcPr>
+          <w:p>
+            <w:r>
+              <w:t>Paso 6: Inserción a la última posición de la lista SLL creada previamente</w:t>
+            </w:r>
+          </w:p>
+        </w:tc>
+        <w:tc>
+          <w:tcPr>
+            <w:tcW w:w="4275" w:type="dxa"/>
+          </w:tcPr>
+          <w:p/>
+        </w:tc>
+      </w:tr>
+      <w:tr>
+        <w:trPr>
+          <w:trHeight w:val="300"/>
+        </w:trPr>
+        <w:tc>
+          <w:tcPr>
+            <w:tcW w:w="5070" w:type="dxa"/>
+          </w:tcPr>
+          <w:p>
+            <w:r>
+              <w:t>Paso 7: C</w:t>
+            </w:r>
+          </w:p>
+        </w:tc>
+        <w:tc>
+          <w:tcPr>
+            <w:tcW w:w="4275" w:type="dxa"/>
+          </w:tcPr>
+          <w:p/>
+        </w:tc>
+      </w:tr>
+      <w:tr>
+        <w:trPr>
+          <w:trHeight w:val="300"/>
+        </w:trPr>
+        <w:tc>
+          <w:tcPr>
+            <w:tcW w:w="5070" w:type="dxa"/>
+          </w:tcPr>
+          <w:p/>
+        </w:tc>
+        <w:tc>
+          <w:tcPr>
+            <w:tcW w:w="4275" w:type="dxa"/>
+          </w:tcPr>
+          <w:p/>
+        </w:tc>
+      </w:tr>
+      <w:tr>
+        <w:trPr>
+          <w:trHeight w:val="300"/>
+        </w:trPr>
+        <w:tc>
+          <w:tcPr>
+            <w:tcW w:w="5070" w:type="dxa"/>
+          </w:tcPr>
+          <w:p/>
+        </w:tc>
+        <w:tc>
+          <w:tcPr>
+            <w:tcW w:w="4275" w:type="dxa"/>
+          </w:tcPr>
+          <w:p/>
+        </w:tc>
+      </w:tr>
+      <w:tr>
+        <w:trPr>
+          <w:trHeight w:val="300"/>
+        </w:trPr>
+        <w:tc>
+          <w:tcPr>
+            <w:tcW w:w="5070" w:type="dxa"/>
+          </w:tcPr>
+          <w:p/>
+        </w:tc>
+        <w:tc>
+          <w:tcPr>
+            <w:tcW w:w="4275" w:type="dxa"/>
+          </w:tcPr>
+          <w:p/>
+        </w:tc>
+      </w:tr>
+      <w:tr>
+        <w:trPr>
+          <w:trHeight w:val="300"/>
+        </w:trPr>
+        <w:tc>
+          <w:tcPr>
+            <w:tcW w:w="5070" w:type="dxa"/>
+          </w:tcPr>
+          <w:p/>
+        </w:tc>
+        <w:tc>
+          <w:tcPr>
+            <w:tcW w:w="4275" w:type="dxa"/>
+          </w:tcPr>
+          <w:p/>
         </w:tc>
       </w:tr>
       <w:tr>
@@ -518,6 +785,15 @@
           <w:bCs/>
         </w:rPr>
       </w:pPr>
+    </w:p>
+    <w:p>
+      <w:pPr>
+        <w:pStyle w:val="Ttulo1"/>
+        <w:rPr>
+          <w:b/>
+          <w:bCs/>
+        </w:rPr>
+      </w:pPr>
       <w:r>
         <w:rPr>
           <w:b/>
@@ -552,7 +828,19 @@
     </w:p>
     <w:p>
       <w:r>
-        <w:t>Breve descripción de como abordaron la implementación del requerimiento</w:t>
+        <w:t xml:space="preserve">Para resolver este requerimiento implemente el TAD ARRAY, </w:t>
+      </w:r>
+      <w:r>
+        <w:t>primero use un ciclo y un condicional IF para encontrar los productos que cumplen los requisitos de entrada,</w:t>
+      </w:r>
+      <w:r>
+        <w:t xml:space="preserve"> luego inicialice las variables de suma para calcular los promedios que se deben devolver, </w:t>
+      </w:r>
+      <w:r>
+        <w:t>luego use un ciclo para el requerimiento de encontrar el pedido mas reciente dentro del rango y otro ciclo para encontrar los pedidos de mayor y menor monto</w:t>
+      </w:r>
+      <w:r>
+        <w:t>, luego construí diccionarios para presentar las respuestas y se retorna lo que pide el requerimiento usando un diccionario</w:t>
       </w:r>
     </w:p>
     <w:tbl>
@@ -615,7 +903,6 @@
                 <w:b/>
                 <w:bCs/>
               </w:rPr>
-              <w:lastRenderedPageBreak/>
               <w:t>Salidas</w:t>
             </w:r>
           </w:p>
@@ -643,10 +930,7 @@
             </w:r>
             <w:proofErr w:type="spellEnd"/>
             <w:r>
-              <w:t xml:space="preserve">, </w:t>
-            </w:r>
-            <w:r>
-              <w:t xml:space="preserve">Promedio de </w:t>
+              <w:t xml:space="preserve">, Promedio de </w:t>
             </w:r>
             <w:proofErr w:type="spellStart"/>
             <w:r>
@@ -654,10 +938,7 @@
             </w:r>
             <w:proofErr w:type="spellEnd"/>
             <w:r>
-              <w:t xml:space="preserve"> y </w:t>
-            </w:r>
-            <w:r>
-              <w:t xml:space="preserve">Promedio de </w:t>
+              <w:t xml:space="preserve"> y Promedio de </w:t>
             </w:r>
             <w:proofErr w:type="spellStart"/>
             <w:r>
@@ -736,10 +1017,27 @@
     </w:p>
     <w:p>
       <w:r>
-        <w:t xml:space="preserve">Para mayor claridad N es el total de </w:t>
-      </w:r>
-      <w:r>
-        <w:t>el csv y n es el total de la lista filtrada</w:t>
+        <w:t>Para mayor claridad N es el total de</w:t>
+      </w:r>
+      <w:r>
+        <w:t xml:space="preserve"> pedidos</w:t>
+      </w:r>
+      <w:r>
+        <w:t xml:space="preserve"> </w:t>
+      </w:r>
+      <w:r>
+        <w:t>d</w:t>
+      </w:r>
+      <w:r>
+        <w:t xml:space="preserve">el </w:t>
+      </w:r>
+      <w:proofErr w:type="spellStart"/>
+      <w:r>
+        <w:t>csv</w:t>
+      </w:r>
+      <w:proofErr w:type="spellEnd"/>
+      <w:r>
+        <w:t xml:space="preserve"> y n es el total de la lista filtrada</w:t>
       </w:r>
     </w:p>
     <w:tbl>
@@ -808,13 +1106,7 @@
           </w:tcPr>
           <w:p>
             <w:r>
-              <w:t>Paso 1</w:t>
-            </w:r>
-            <w:r>
-              <w:t xml:space="preserve">: </w:t>
-            </w:r>
-            <w:r>
-              <w:t>filtrar todos los datos del csv</w:t>
+              <w:t>Paso 1: tomar el tiempo de inicio</w:t>
             </w:r>
           </w:p>
         </w:tc>
@@ -824,13 +1116,7 @@
           </w:tcPr>
           <w:p>
             <w:r>
-              <w:t>O(</w:t>
-            </w:r>
-            <w:r>
-              <w:t>N</w:t>
-            </w:r>
-            <w:r>
-              <w:t>)</w:t>
+              <w:t>O(1)</w:t>
             </w:r>
           </w:p>
         </w:tc>
@@ -845,10 +1131,53 @@
           </w:tcPr>
           <w:p>
             <w:r>
-              <w:t xml:space="preserve">Paso 2 </w:t>
-            </w:r>
-            <w:r>
-              <w:t>sumar los valores necesarios para el promedio</w:t>
+              <w:t xml:space="preserve">Paso </w:t>
+            </w:r>
+            <w:r>
+              <w:t>2</w:t>
+            </w:r>
+            <w:r>
+              <w:t xml:space="preserve">: </w:t>
+            </w:r>
+            <w:r>
+              <w:t>filtrar todos los datos del csv</w:t>
+            </w:r>
+          </w:p>
+        </w:tc>
+        <w:tc>
+          <w:tcPr>
+            <w:tcW w:w="4307" w:type="dxa"/>
+          </w:tcPr>
+          <w:p>
+            <w:r>
+              <w:t>O(</w:t>
+            </w:r>
+            <w:r>
+              <w:t>N</w:t>
+            </w:r>
+            <w:r>
+              <w:t>)</w:t>
+            </w:r>
+          </w:p>
+        </w:tc>
+      </w:tr>
+      <w:tr>
+        <w:trPr>
+          <w:trHeight w:val="384"/>
+        </w:trPr>
+        <w:tc>
+          <w:tcPr>
+            <w:tcW w:w="5107" w:type="dxa"/>
+          </w:tcPr>
+          <w:p>
+            <w:r>
+              <w:t xml:space="preserve">Paso </w:t>
+            </w:r>
+            <w:r>
+              <w:t>3: sumar</w:t>
+            </w:r>
+            <w:r>
+              <w:t xml:space="preserve"> los valores necesarios para el promedio</w:t>
             </w:r>
           </w:p>
         </w:tc>
@@ -882,7 +1211,13 @@
               <w:t>Paso</w:t>
             </w:r>
             <w:r>
-              <w:t xml:space="preserve"> 3 </w:t>
+              <w:t xml:space="preserve"> </w:t>
+            </w:r>
+            <w:r>
+              <w:t>4:</w:t>
+            </w:r>
+            <w:r>
+              <w:t xml:space="preserve"> </w:t>
             </w:r>
             <w:r>
               <w:t>sacar los promedios</w:t>
@@ -894,11 +1229,9 @@
             <w:tcW w:w="4307" w:type="dxa"/>
           </w:tcPr>
           <w:p>
-            <w:proofErr w:type="gramStart"/>
             <w:r>
               <w:t>O(</w:t>
             </w:r>
-            <w:proofErr w:type="gramEnd"/>
             <w:r>
               <w:t>1</w:t>
             </w:r>
@@ -932,13 +1265,10 @@
               <w:t xml:space="preserve"> </w:t>
             </w:r>
             <w:r>
-              <w:t>4</w:t>
-            </w:r>
-            <w:r>
-              <w:t xml:space="preserve"> </w:t>
-            </w:r>
-            <w:r>
-              <w:t xml:space="preserve">encontrar el </w:t>
+              <w:t>5:</w:t>
+            </w:r>
+            <w:r>
+              <w:t xml:space="preserve"> encontrar el </w:t>
             </w:r>
             <w:r>
               <w:t>pedido más</w:t>
@@ -997,13 +1327,10 @@
               <w:t xml:space="preserve"> </w:t>
             </w:r>
             <w:r>
-              <w:t>5</w:t>
-            </w:r>
-            <w:r>
-              <w:t xml:space="preserve"> </w:t>
-            </w:r>
-            <w:r>
-              <w:t xml:space="preserve">encontrar el pedido con mayor </w:t>
+              <w:t>6:</w:t>
+            </w:r>
+            <w:r>
+              <w:t xml:space="preserve"> encontrar el pedido con mayor </w:t>
             </w:r>
             <w:r>
               <w:t xml:space="preserve">y menor </w:t>
@@ -1053,10 +1380,16 @@
               <w:t xml:space="preserve">Paso </w:t>
             </w:r>
             <w:r>
-              <w:t>6</w:t>
-            </w:r>
-            <w:r>
-              <w:t xml:space="preserve"> definir diccionarios para el return de los pedidos </w:t>
+              <w:t xml:space="preserve">7: </w:t>
+            </w:r>
+            <w:r>
+              <w:t xml:space="preserve">definir diccionarios para </w:t>
+            </w:r>
+            <w:r>
+              <w:t>la salida</w:t>
+            </w:r>
+            <w:r>
+              <w:t xml:space="preserve"> de los pedidos </w:t>
             </w:r>
             <w:r>
               <w:t>específicos</w:t>
@@ -1082,16 +1415,8 @@
                 <w:iCs/>
               </w:rPr>
             </w:pPr>
-            <w:proofErr w:type="gramStart"/>
-            <w:r>
-              <w:t>O(</w:t>
-            </w:r>
-            <w:proofErr w:type="gramEnd"/>
-            <w:r>
-              <w:t>1</w:t>
-            </w:r>
-            <w:r>
-              <w:t>)</w:t>
+            <w:r>
+              <w:t>O(1)</w:t>
             </w:r>
           </w:p>
         </w:tc>
@@ -1105,6 +1430,70 @@
             <w:tcW w:w="5107" w:type="dxa"/>
           </w:tcPr>
           <w:p>
+            <w:r>
+              <w:t>Paso 8</w:t>
+            </w:r>
+            <w:r>
+              <w:t>: tomar tiempo de fin</w:t>
+            </w:r>
+          </w:p>
+        </w:tc>
+        <w:tc>
+          <w:tcPr>
+            <w:tcW w:w="4307" w:type="dxa"/>
+          </w:tcPr>
+          <w:p>
+            <w:r>
+              <w:t>O(1)</w:t>
+            </w:r>
+          </w:p>
+        </w:tc>
+      </w:tr>
+      <w:tr>
+        <w:trPr>
+          <w:trHeight w:val="384"/>
+        </w:trPr>
+        <w:tc>
+          <w:tcPr>
+            <w:tcW w:w="5107" w:type="dxa"/>
+          </w:tcPr>
+          <w:p>
+            <w:r>
+              <w:t xml:space="preserve">Paso 9: usar </w:t>
+            </w:r>
+            <w:proofErr w:type="spellStart"/>
+            <w:r>
+              <w:t>delta_time</w:t>
+            </w:r>
+            <w:proofErr w:type="spellEnd"/>
+            <w:r>
+              <w:t xml:space="preserve">() para </w:t>
+            </w:r>
+            <w:r>
+              <w:t>calcular el tiempo de ejecución</w:t>
+            </w:r>
+          </w:p>
+        </w:tc>
+        <w:tc>
+          <w:tcPr>
+            <w:tcW w:w="4307" w:type="dxa"/>
+          </w:tcPr>
+          <w:p>
+            <w:r>
+              <w:t>O(1)</w:t>
+            </w:r>
+          </w:p>
+        </w:tc>
+      </w:tr>
+      <w:tr>
+        <w:trPr>
+          <w:trHeight w:val="384"/>
+        </w:trPr>
+        <w:tc>
+          <w:tcPr>
+            <w:tcW w:w="5107" w:type="dxa"/>
+          </w:tcPr>
+          <w:p>
             <w:pPr>
               <w:tabs>
                 <w:tab w:val="left" w:pos="4080"/>
@@ -1215,27 +1604,11 @@
       </w:r>
       <w:proofErr w:type="spellStart"/>
       <w:r>
-        <w:t>add_</w:t>
-      </w:r>
-      <w:proofErr w:type="gramStart"/>
-      <w:r>
-        <w:t>last</w:t>
+        <w:t>add_last</w:t>
       </w:r>
       <w:proofErr w:type="spellEnd"/>
       <w:r>
-        <w:t>(</w:t>
-      </w:r>
-      <w:proofErr w:type="gramEnd"/>
-      <w:r>
-        <w:t xml:space="preserve">) mantiene una complejidad de </w:t>
-      </w:r>
-      <w:proofErr w:type="gramStart"/>
-      <w:r>
-        <w:t>O(</w:t>
-      </w:r>
-      <w:proofErr w:type="gramEnd"/>
-      <w:r>
-        <w:t>1)</w:t>
+        <w:t>() mantiene una complejidad de O(1)</w:t>
       </w:r>
     </w:p>
     <w:p>
@@ -1251,14 +1624,7 @@
           <w:b/>
           <w:bCs/>
         </w:rPr>
-        <w:t xml:space="preserve">Requerimiento </w:t>
-      </w:r>
-      <w:r>
-        <w:rPr>
-          <w:b/>
-          <w:bCs/>
-        </w:rPr>
-        <w:t>3</w:t>
+        <w:t>Requerimiento 3</w:t>
       </w:r>
     </w:p>
     <w:p>
@@ -1409,7 +1775,6 @@
           <w:b/>
           <w:bCs/>
         </w:rPr>
-        <w:lastRenderedPageBreak/>
         <w:t>Análisis de complejidad</w:t>
       </w:r>
     </w:p>
@@ -1522,13 +1887,8 @@
           </w:tcPr>
           <w:p>
             <w:r>
-              <w:t>Paso</w:t>
-            </w:r>
-            <w:proofErr w:type="gramStart"/>
-            <w:r>
-              <w:t xml:space="preserve"> ….</w:t>
-            </w:r>
-            <w:proofErr w:type="gramEnd"/>
+              <w:t>Paso ….</w:t>
+            </w:r>
           </w:p>
         </w:tc>
         <w:tc>
@@ -1642,14 +2002,7 @@
           <w:b/>
           <w:bCs/>
         </w:rPr>
-        <w:t xml:space="preserve">Requerimiento </w:t>
-      </w:r>
-      <w:r>
-        <w:rPr>
-          <w:b/>
-          <w:bCs/>
-        </w:rPr>
-        <w:t>4</w:t>
+        <w:t>Requerimiento 4</w:t>
       </w:r>
     </w:p>
     <w:p>
@@ -1720,7 +2073,19 @@
           </w:tcPr>
           <w:p>
             <w:r>
-              <w:t>Parámetros necesarios para resolver el requerimiento.</w:t>
+              <w:t xml:space="preserve">Recibe el catalogo con todos los datos, el </w:t>
+            </w:r>
+            <w:r>
+              <w:t xml:space="preserve">producto del que se buscan </w:t>
+            </w:r>
+            <w:r>
+              <w:t xml:space="preserve">pedidos </w:t>
+            </w:r>
+            <w:r>
+              <w:t xml:space="preserve">y el país del que se buscan </w:t>
+            </w:r>
+            <w:r>
+              <w:t>los pedidos</w:t>
             </w:r>
           </w:p>
         </w:tc>
@@ -1752,7 +2117,57 @@
           </w:tcPr>
           <w:p>
             <w:r>
-              <w:t>Respuesta esperada del algoritmo.</w:t>
+              <w:t xml:space="preserve">Devuelve el tiempo de </w:t>
+            </w:r>
+            <w:r>
+              <w:t>ejecución</w:t>
+            </w:r>
+            <w:r>
+              <w:t xml:space="preserve"> en ms, </w:t>
+            </w:r>
+            <w:r>
+              <w:t xml:space="preserve">el total de pedidos que cumplen las condiciones, </w:t>
+            </w:r>
+            <w:r>
+              <w:t xml:space="preserve">promedios de </w:t>
+            </w:r>
+            <w:proofErr w:type="spellStart"/>
+            <w:r>
+              <w:t>Price_per_box</w:t>
+            </w:r>
+            <w:proofErr w:type="spellEnd"/>
+            <w:r>
+              <w:t xml:space="preserve">, </w:t>
+            </w:r>
+            <w:proofErr w:type="spellStart"/>
+            <w:r>
+              <w:t>Discount_pct</w:t>
+            </w:r>
+            <w:proofErr w:type="spellEnd"/>
+            <w:r>
+              <w:t xml:space="preserve">, </w:t>
+            </w:r>
+            <w:proofErr w:type="spellStart"/>
+            <w:r>
+              <w:t>Marketing_spend</w:t>
+            </w:r>
+            <w:proofErr w:type="spellEnd"/>
+            <w:r>
+              <w:t xml:space="preserve"> y de </w:t>
+            </w:r>
+            <w:proofErr w:type="spellStart"/>
+            <w:r>
+              <w:t>Boxes_shipped</w:t>
+            </w:r>
+            <w:proofErr w:type="spellEnd"/>
+            <w:r>
+              <w:t xml:space="preserve"> para los pedidos que cumplen las condiciones</w:t>
+            </w:r>
+            <w:r>
+              <w:t xml:space="preserve"> y los dos pedidos de mayor monto </w:t>
+            </w:r>
+            <w:r>
+              <w:t>dentro de las condiciones</w:t>
             </w:r>
           </w:p>
         </w:tc>
@@ -1784,7 +2199,16 @@
           </w:tcPr>
           <w:p>
             <w:r>
-              <w:t>Si se implementó y quien lo hizo.</w:t>
+              <w:t>Si</w:t>
+            </w:r>
+            <w:r>
+              <w:t>,</w:t>
+            </w:r>
+            <w:r>
+              <w:t xml:space="preserve"> se implement</w:t>
+            </w:r>
+            <w:r>
+              <w:t>o</w:t>
             </w:r>
           </w:p>
         </w:tc>
@@ -1809,7 +2233,15 @@
     </w:p>
     <w:p>
       <w:r>
-        <w:t>Análisis de complejidad de cada uno de los pasos del algoritmo</w:t>
+        <w:t xml:space="preserve">Para mayor claridad N es el total de pedidos del </w:t>
+      </w:r>
+      <w:proofErr w:type="spellStart"/>
+      <w:r>
+        <w:t>csv</w:t>
+      </w:r>
+      <w:proofErr w:type="spellEnd"/>
+      <w:r>
+        <w:t xml:space="preserve"> y n es el total de la lista filtrada</w:t>
       </w:r>
     </w:p>
     <w:tbl>
@@ -1872,7 +2304,10 @@
           </w:tcPr>
           <w:p>
             <w:r>
-              <w:t>Paso 1</w:t>
+              <w:t xml:space="preserve">Paso </w:t>
+            </w:r>
+            <w:r>
+              <w:t>1: tomar tiempo de inicio</w:t>
             </w:r>
           </w:p>
         </w:tc>
@@ -1882,7 +2317,13 @@
           </w:tcPr>
           <w:p>
             <w:r>
-              <w:t>O(...)</w:t>
+              <w:t>O(</w:t>
+            </w:r>
+            <w:r>
+              <w:t>1</w:t>
+            </w:r>
+            <w:r>
+              <w:t>)</w:t>
             </w:r>
           </w:p>
         </w:tc>
@@ -1894,7 +2335,19 @@
           </w:tcPr>
           <w:p>
             <w:r>
-              <w:t xml:space="preserve">Paso 2 </w:t>
+              <w:t>Paso</w:t>
+            </w:r>
+            <w:r>
+              <w:t xml:space="preserve"> </w:t>
+            </w:r>
+            <w:r>
+              <w:t>2</w:t>
+            </w:r>
+            <w:r>
+              <w:t xml:space="preserve">: </w:t>
+            </w:r>
+            <w:r>
+              <w:t>crear la lista filtrada y filtrar los pedidos</w:t>
             </w:r>
           </w:p>
         </w:tc>
@@ -1904,7 +2357,13 @@
           </w:tcPr>
           <w:p>
             <w:r>
-              <w:t>O(...)</w:t>
+              <w:t>O(</w:t>
+            </w:r>
+            <w:r>
+              <w:t>N</w:t>
+            </w:r>
+            <w:r>
+              <w:t>)</w:t>
             </w:r>
           </w:p>
         </w:tc>
@@ -1916,13 +2375,17 @@
           </w:tcPr>
           <w:p>
             <w:r>
-              <w:t>Paso</w:t>
-            </w:r>
-            <w:proofErr w:type="gramStart"/>
-            <w:r>
-              <w:t xml:space="preserve"> ….</w:t>
-            </w:r>
-            <w:proofErr w:type="gramEnd"/>
+              <w:t xml:space="preserve">Paso </w:t>
+            </w:r>
+            <w:r>
+              <w:t>3</w:t>
+            </w:r>
+            <w:r>
+              <w:t xml:space="preserve">: </w:t>
+            </w:r>
+            <w:r>
+              <w:t>verificar que allá pedidos que cumplan las condiciones</w:t>
+            </w:r>
           </w:p>
         </w:tc>
         <w:tc>
@@ -1931,7 +2394,7 @@
           </w:tcPr>
           <w:p>
             <w:r>
-              <w:t>O(...)</w:t>
+              <w:t>O(1)</w:t>
             </w:r>
           </w:p>
         </w:tc>
@@ -1942,6 +2405,150 @@
             <w:tcW w:w="5070" w:type="dxa"/>
           </w:tcPr>
           <w:p>
+            <w:r>
+              <w:t xml:space="preserve">Paso </w:t>
+            </w:r>
+            <w:r>
+              <w:t>4: crear variables de suma para los promedios</w:t>
+            </w:r>
+          </w:p>
+        </w:tc>
+        <w:tc>
+          <w:tcPr>
+            <w:tcW w:w="4275" w:type="dxa"/>
+          </w:tcPr>
+          <w:p>
+            <w:r>
+              <w:t>O(1)</w:t>
+            </w:r>
+          </w:p>
+        </w:tc>
+      </w:tr>
+      <w:tr>
+        <w:tc>
+          <w:tcPr>
+            <w:tcW w:w="5070" w:type="dxa"/>
+          </w:tcPr>
+          <w:p>
+            <w:r>
+              <w:t xml:space="preserve">Paso 5: </w:t>
+            </w:r>
+            <w:r>
+              <w:t>encontrar los dos pedidos con mayor monto</w:t>
+            </w:r>
+            <w:r>
+              <w:t xml:space="preserve"> y sumar los valores para los promedios </w:t>
+            </w:r>
+          </w:p>
+        </w:tc>
+        <w:tc>
+          <w:tcPr>
+            <w:tcW w:w="4275" w:type="dxa"/>
+          </w:tcPr>
+          <w:p>
+            <w:r>
+              <w:t>O(n)</w:t>
+            </w:r>
+          </w:p>
+        </w:tc>
+      </w:tr>
+      <w:tr>
+        <w:tc>
+          <w:tcPr>
+            <w:tcW w:w="5070" w:type="dxa"/>
+          </w:tcPr>
+          <w:p>
+            <w:r>
+              <w:t>Paso 6: calcular los promedios requeridos</w:t>
+            </w:r>
+          </w:p>
+        </w:tc>
+        <w:tc>
+          <w:tcPr>
+            <w:tcW w:w="4275" w:type="dxa"/>
+          </w:tcPr>
+          <w:p>
+            <w:r>
+              <w:t>O(1)</w:t>
+            </w:r>
+          </w:p>
+        </w:tc>
+      </w:tr>
+      <w:tr>
+        <w:tc>
+          <w:tcPr>
+            <w:tcW w:w="5070" w:type="dxa"/>
+          </w:tcPr>
+          <w:p>
+            <w:r>
+              <w:t>Paso 7: definir diccionarios con los datos requeridos para los dos pedidos de mayor monto</w:t>
+            </w:r>
+          </w:p>
+        </w:tc>
+        <w:tc>
+          <w:tcPr>
+            <w:tcW w:w="4275" w:type="dxa"/>
+          </w:tcPr>
+          <w:p>
+            <w:r>
+              <w:t>O(1)</w:t>
+            </w:r>
+          </w:p>
+        </w:tc>
+      </w:tr>
+      <w:tr>
+        <w:tc>
+          <w:tcPr>
+            <w:tcW w:w="5070" w:type="dxa"/>
+          </w:tcPr>
+          <w:p>
+            <w:r>
+              <w:t>Paso 8: tomar tiempo de fin</w:t>
+            </w:r>
+          </w:p>
+        </w:tc>
+        <w:tc>
+          <w:tcPr>
+            <w:tcW w:w="4275" w:type="dxa"/>
+          </w:tcPr>
+          <w:p>
+            <w:r>
+              <w:t>O(1)</w:t>
+            </w:r>
+          </w:p>
+        </w:tc>
+      </w:tr>
+      <w:tr>
+        <w:tc>
+          <w:tcPr>
+            <w:tcW w:w="5070" w:type="dxa"/>
+          </w:tcPr>
+          <w:p>
+            <w:r>
+              <w:t xml:space="preserve">Paso 9: </w:t>
+            </w:r>
+            <w:r>
+              <w:t xml:space="preserve">calcular tiempo de ejecución </w:t>
+            </w:r>
+          </w:p>
+        </w:tc>
+        <w:tc>
+          <w:tcPr>
+            <w:tcW w:w="4275" w:type="dxa"/>
+          </w:tcPr>
+          <w:p>
+            <w:r>
+              <w:t>O(1)</w:t>
+            </w:r>
+          </w:p>
+        </w:tc>
+      </w:tr>
+      <w:tr>
+        <w:tc>
+          <w:tcPr>
+            <w:tcW w:w="5070" w:type="dxa"/>
+          </w:tcPr>
+          <w:p>
             <w:pPr>
               <w:rPr>
                 <w:b/>
@@ -1981,7 +2588,25 @@
                 <w:i/>
                 <w:iCs/>
               </w:rPr>
-              <w:t>O(...)</w:t>
+              <w:t>O(</w:t>
+            </w:r>
+            <w:r>
+              <w:rPr>
+                <w:b/>
+                <w:bCs/>
+                <w:i/>
+                <w:iCs/>
+              </w:rPr>
+              <w:t>N</w:t>
+            </w:r>
+            <w:r>
+              <w:rPr>
+                <w:b/>
+                <w:bCs/>
+                <w:i/>
+                <w:iCs/>
+              </w:rPr>
+              <w:t>)</w:t>
             </w:r>
           </w:p>
         </w:tc>
@@ -2012,15 +2637,27 @@
     </w:p>
     <w:p>
       <w:r>
-        <w:t xml:space="preserve">Análisis de resultados de la implementación, tener cuenta las pruebas realizadas y el </w:t>
+        <w:t xml:space="preserve">La complejidad de el algoritmo para el requerimiento 4 es </w:t>
+      </w:r>
+      <w:r>
+        <w:t xml:space="preserve">O(N), la mayor complejidad es definida por el numero de elementos en el </w:t>
       </w:r>
       <w:proofErr w:type="spellStart"/>
       <w:r>
-        <w:t>analisis</w:t>
+        <w:t>csv</w:t>
       </w:r>
       <w:proofErr w:type="spellEnd"/>
       <w:r>
-        <w:t xml:space="preserve"> de complejidad.</w:t>
+        <w:t xml:space="preserve"> con todos los pedidos, porque se deben revisar uno por uno para filtrarlos</w:t>
+      </w:r>
+      <w:r>
+        <w:t xml:space="preserve">, después de eso los ciclos  que se usan para sumar en los promedios y en encontrar los </w:t>
+      </w:r>
+      <w:r>
+        <w:t>dos pedidos de mayor monto tienen complejidad O(n)</w:t>
+      </w:r>
+      <w:r>
+        <w:t xml:space="preserve"> </w:t>
       </w:r>
     </w:p>
     <w:p>
@@ -2036,14 +2673,7 @@
           <w:b/>
           <w:bCs/>
         </w:rPr>
-        <w:t xml:space="preserve">Requerimiento </w:t>
-      </w:r>
-      <w:r>
-        <w:rPr>
-          <w:b/>
-          <w:bCs/>
-        </w:rPr>
-        <w:t>5</w:t>
+        <w:t>Requerimiento 5</w:t>
       </w:r>
     </w:p>
     <w:p>
@@ -2100,7 +2730,6 @@
                 <w:b/>
                 <w:bCs/>
               </w:rPr>
-              <w:lastRenderedPageBreak/>
               <w:t xml:space="preserve">Entrada </w:t>
             </w:r>
           </w:p>
@@ -2111,7 +2740,19 @@
           </w:tcPr>
           <w:p>
             <w:r>
-              <w:t>Parámetros necesarios para resolver el requerimiento.</w:t>
+              <w:t xml:space="preserve">Se recibe el catalogo con todos los pedidos, </w:t>
+            </w:r>
+            <w:r>
+              <w:t>una palabra</w:t>
+            </w:r>
+            <w:r>
+              <w:t xml:space="preserve"> de filtro </w:t>
+            </w:r>
+            <w:r>
+              <w:t xml:space="preserve"> que puede ser MAYOR o MENOR</w:t>
+            </w:r>
+            <w:r>
+              <w:t>, un producto, una fecha de inicio y una fecha de final</w:t>
             </w:r>
           </w:p>
         </w:tc>
@@ -2143,7 +2784,41 @@
           </w:tcPr>
           <w:p>
             <w:r>
-              <w:t>Respuesta esperada del algoritmo.</w:t>
+              <w:t xml:space="preserve">El algoritmo devuelve </w:t>
+            </w:r>
+            <w:r>
+              <w:t xml:space="preserve">el tiempo de </w:t>
+            </w:r>
+            <w:proofErr w:type="spellStart"/>
+            <w:r>
+              <w:t>ejecucion</w:t>
+            </w:r>
+            <w:proofErr w:type="spellEnd"/>
+            <w:r>
+              <w:t xml:space="preserve"> en ms, </w:t>
+            </w:r>
+            <w:r>
+              <w:t xml:space="preserve">la palabra de filtro, </w:t>
+            </w:r>
+            <w:r>
+              <w:t>el numero de pedidos que cumplen los requisitos</w:t>
+            </w:r>
+            <w:r>
+              <w:t xml:space="preserve">, el pedido de mayor o menor monto </w:t>
+            </w:r>
+            <w:r>
+              <w:t xml:space="preserve">según el filtro </w:t>
+            </w:r>
+            <w:r>
+              <w:t xml:space="preserve">y promedios de </w:t>
+            </w:r>
+            <w:proofErr w:type="spellStart"/>
+            <w:r>
+              <w:t>price_per_box</w:t>
+            </w:r>
+            <w:proofErr w:type="spellEnd"/>
+            <w:r>
+              <w:t xml:space="preserve">, </w:t>
             </w:r>
           </w:p>
         </w:tc>
@@ -2175,7 +2850,16 @@
           </w:tcPr>
           <w:p>
             <w:r>
-              <w:t>Si se implementó y quien lo hizo.</w:t>
+              <w:t>Si</w:t>
+            </w:r>
+            <w:r>
+              <w:t>,</w:t>
+            </w:r>
+            <w:r>
+              <w:t xml:space="preserve"> se implement</w:t>
+            </w:r>
+            <w:r>
+              <w:t xml:space="preserve">o </w:t>
             </w:r>
           </w:p>
         </w:tc>
@@ -2201,6 +2885,19 @@
     <w:p>
       <w:r>
         <w:t>Análisis de complejidad de cada uno de los pasos del algoritmo</w:t>
+      </w:r>
+    </w:p>
+    <w:p>
+      <w:r>
+        <w:t xml:space="preserve">Para mayor claridad N es el total de pedidos del </w:t>
+      </w:r>
+      <w:proofErr w:type="spellStart"/>
+      <w:r>
+        <w:t>csv</w:t>
+      </w:r>
+      <w:proofErr w:type="spellEnd"/>
+      <w:r>
+        <w:t xml:space="preserve"> y n es el total de la lista filtrada</w:t>
       </w:r>
     </w:p>
     <w:tbl>
@@ -2307,13 +3004,8 @@
           </w:tcPr>
           <w:p>
             <w:r>
-              <w:t>Paso</w:t>
-            </w:r>
-            <w:proofErr w:type="gramStart"/>
-            <w:r>
-              <w:t xml:space="preserve"> ….</w:t>
-            </w:r>
-            <w:proofErr w:type="gramEnd"/>
+              <w:t>Paso ….</w:t>
+            </w:r>
           </w:p>
         </w:tc>
         <w:tc>
@@ -2427,21 +3119,10 @@
           <w:b/>
           <w:bCs/>
         </w:rPr>
-        <w:t xml:space="preserve">Requerimiento </w:t>
-      </w:r>
-      <w:r>
-        <w:rPr>
-          <w:b/>
-          <w:bCs/>
-        </w:rPr>
-        <w:t>6</w:t>
+        <w:t>Requerimiento 6</w:t>
       </w:r>
     </w:p>
-    <w:p>
-      <w:r>
-        <w:t>Plantilla para el documentar y analizar cada uno de los requerimientos.</w:t>
-      </w:r>
-    </w:p>
+    <w:p/>
     <w:p>
       <w:pPr>
         <w:pStyle w:val="Ttulo2"/>
@@ -2458,11 +3139,7 @@
         <w:t>Descripción</w:t>
       </w:r>
     </w:p>
-    <w:p>
-      <w:r>
-        <w:t>Breve descripción de como abordaron la implementación del requerimiento</w:t>
-      </w:r>
-    </w:p>
+    <w:p/>
     <w:tbl>
       <w:tblPr>
         <w:tblStyle w:val="Tablaconcuadrcula"/>
@@ -2499,11 +3176,7 @@
           <w:tcPr>
             <w:tcW w:w="6300" w:type="dxa"/>
           </w:tcPr>
-          <w:p>
-            <w:r>
-              <w:t>Parámetros necesarios para resolver el requerimiento.</w:t>
-            </w:r>
-          </w:p>
+          <w:p/>
         </w:tc>
       </w:tr>
       <w:tr>
@@ -2531,11 +3204,7 @@
           <w:tcPr>
             <w:tcW w:w="6300" w:type="dxa"/>
           </w:tcPr>
-          <w:p>
-            <w:r>
-              <w:t>Respuesta esperada del algoritmo.</w:t>
-            </w:r>
-          </w:p>
+          <w:p/>
         </w:tc>
       </w:tr>
       <w:tr>
@@ -2565,7 +3234,7 @@
           </w:tcPr>
           <w:p>
             <w:r>
-              <w:t>Si se implementó y quien lo hizo.</w:t>
+              <w:t>Si, se implemento</w:t>
             </w:r>
           </w:p>
         </w:tc>
@@ -2593,6 +3262,20 @@
         <w:t>Análisis de complejidad de cada uno de los pasos del algoritmo</w:t>
       </w:r>
     </w:p>
+    <w:p>
+      <w:r>
+        <w:t xml:space="preserve">Para mayor claridad N es el total de pedidos del </w:t>
+      </w:r>
+      <w:proofErr w:type="spellStart"/>
+      <w:r>
+        <w:t>csv</w:t>
+      </w:r>
+      <w:proofErr w:type="spellEnd"/>
+      <w:r>
+        <w:t xml:space="preserve"> y n es el total de la lista filtrada</w:t>
+      </w:r>
+    </w:p>
+    <w:p/>
     <w:tbl>
       <w:tblPr>
         <w:tblStyle w:val="Tablaconcuadrcula"/>
@@ -2697,13 +3380,8 @@
           </w:tcPr>
           <w:p>
             <w:r>
-              <w:t>Paso</w:t>
-            </w:r>
-            <w:proofErr w:type="gramStart"/>
-            <w:r>
-              <w:t xml:space="preserve"> ….</w:t>
-            </w:r>
-            <w:proofErr w:type="gramEnd"/>
+              <w:t>Paso ….</w:t>
+            </w:r>
           </w:p>
         </w:tc>
         <w:tc>
@@ -2818,7 +3496,6 @@
           <w:b/>
           <w:bCs/>
         </w:rPr>
-        <w:lastRenderedPageBreak/>
         <w:t xml:space="preserve">Requerimiento </w:t>
       </w:r>
       <w:r>
@@ -2852,6 +3529,9 @@
         <w:jc w:val="center"/>
       </w:pPr>
       <w:r>
+        <w:rPr>
+          <w:noProof/>
+        </w:rPr>
         <w:drawing>
           <wp:inline distT="0" distB="0" distL="0" distR="0" wp14:anchorId="35ECC59E" wp14:editId="0A0A9058">
             <wp:extent cx="3547872" cy="1385413"/>
@@ -3189,11 +3869,9 @@
             <w:tcW w:w="4275" w:type="dxa"/>
           </w:tcPr>
           <w:p>
-            <w:proofErr w:type="gramStart"/>
             <w:r>
               <w:t>O(</w:t>
             </w:r>
-            <w:proofErr w:type="gramEnd"/>
             <w:r>
               <w:t>1</w:t>
             </w:r>
@@ -3672,6 +4350,9 @@
         </w:tcPr>
         <w:p>
           <w:r>
+            <w:rPr>
+              <w:noProof/>
+            </w:rPr>
             <w:drawing>
               <wp:inline distT="0" distB="0" distL="0" distR="0" wp14:anchorId="3BB22A4B" wp14:editId="3C60B0AD">
                 <wp:extent cx="1260000" cy="587046"/>
@@ -3786,6 +4467,7 @@
           </w:pPr>
           <w:r>
             <w:rPr>
+              <w:noProof/>
               <w:lang w:eastAsia="es-CO"/>
             </w:rPr>
             <w:drawing>
@@ -3886,6 +4568,119 @@
 <file path=word/numbering.xml><?xml version="1.0" encoding="utf-8"?>
 <w:numbering xmlns:wpc="http://schemas.microsoft.com/office/word/2010/wordprocessingCanvas" xmlns:cx="http://schemas.microsoft.com/office/drawing/2014/chartex" xmlns:cx1="http://schemas.microsoft.com/office/drawing/2015/9/8/chartex" xmlns:cx2="http://schemas.microsoft.com/office/drawing/2015/10/21/chartex" xmlns:cx3="http://schemas.microsoft.com/office/drawing/2016/5/9/chartex" xmlns:cx4="http://schemas.microsoft.com/office/drawing/2016/5/10/chartex" xmlns:cx5="http://schemas.microsoft.com/office/drawing/2016/5/11/chartex" xmlns:cx6="http://schemas.microsoft.com/office/drawing/2016/5/12/chartex" xmlns:cx7="http://schemas.microsoft.com/office/drawing/2016/5/13/chartex" xmlns:cx8="http://schemas.microsoft.com/office/drawing/2016/5/14/chartex" xmlns:mc="http://schemas.openxmlformats.org/markup-compatibility/2006" xmlns:aink="http://schemas.microsoft.com/office/drawing/2016/ink" xmlns:am3d="http://schemas.microsoft.com/office/drawing/2017/model3d" xmlns:o="urn:schemas-microsoft-com:office:office" xmlns:oel="http://schemas.microsoft.com/office/2019/extlst" xmlns:r="http://schemas.openxmlformats.org/officeDocument/2006/relationships" xmlns:m="http://schemas.openxmlformats.org/officeDocument/2006/math" xmlns:v="urn:schemas-microsoft-com:vml" xmlns:wp14="http://schemas.microsoft.com/office/word/2010/wordprocessingDrawing" xmlns:wp="http://schemas.openxmlformats.org/drawingml/2006/wordprocessingDrawing" xmlns:w10="urn:schemas-microsoft-com:office:word" xmlns:w="http://schemas.openxmlformats.org/wordprocessingml/2006/main" xmlns:w14="http://schemas.microsoft.com/office/word/2010/wordml" xmlns:w15="http://schemas.microsoft.com/office/word/2012/wordml" xmlns:w16cex="http://schemas.microsoft.com/office/word/2018/wordml/cex" xmlns:w16cid="http://schemas.microsoft.com/office/word/2016/wordml/cid" xmlns:w16="http://schemas.microsoft.com/office/word/2018/wordml" xmlns:w16du="http://schemas.microsoft.com/office/word/2023/wordml/word16du" xmlns:w16sdtdh="http://schemas.microsoft.com/office/word/2020/wordml/sdtdatahash" xmlns:w16sdtfl="http://schemas.microsoft.com/office/word/2024/wordml/sdtformatlock" xmlns:w16se="http://schemas.microsoft.com/office/word/2015/wordml/symex" xmlns:wpg="http://schemas.microsoft.com/office/word/2010/wordprocessingGroup" xmlns:wpi="http://schemas.microsoft.com/office/word/2010/wordprocessingInk" xmlns:wne="http://schemas.microsoft.com/office/word/2006/wordml" xmlns:wps="http://schemas.microsoft.com/office/word/2010/wordprocessingShape" mc:Ignorable="w14 w15 w16se w16cid w16 w16cex w16sdtdh w16sdtfl w16du wp14">
   <w:abstractNum w:abstractNumId="0" w15:restartNumberingAfterBreak="0">
+    <w:nsid w:val="00CDE36D"/>
+    <w:multiLevelType w:val="hybridMultilevel"/>
+    <w:tmpl w:val="FFFFFFFF"/>
+    <w:lvl w:ilvl="0" w:tplc="6D3E4000">
+      <w:start w:val="1"/>
+      <w:numFmt w:val="bullet"/>
+      <w:lvlText w:val=""/>
+      <w:lvlJc w:val="left"/>
+      <w:pPr>
+        <w:ind w:left="720" w:hanging="360"/>
+      </w:pPr>
+      <w:rPr>
+        <w:rFonts w:ascii="Symbol" w:hAnsi="Symbol" w:hint="default"/>
+      </w:rPr>
+    </w:lvl>
+    <w:lvl w:ilvl="1" w:tplc="A8CC13FC">
+      <w:start w:val="1"/>
+      <w:numFmt w:val="bullet"/>
+      <w:lvlText w:val="o"/>
+      <w:lvlJc w:val="left"/>
+      <w:pPr>
+        <w:ind w:left="1440" w:hanging="360"/>
+      </w:pPr>
+      <w:rPr>
+        <w:rFonts w:ascii="Courier New" w:hAnsi="Courier New" w:hint="default"/>
+      </w:rPr>
+    </w:lvl>
+    <w:lvl w:ilvl="2" w:tplc="F24273E0">
+      <w:start w:val="1"/>
+      <w:numFmt w:val="bullet"/>
+      <w:lvlText w:val=""/>
+      <w:lvlJc w:val="left"/>
+      <w:pPr>
+        <w:ind w:left="2160" w:hanging="360"/>
+      </w:pPr>
+      <w:rPr>
+        <w:rFonts w:ascii="Wingdings" w:hAnsi="Wingdings" w:hint="default"/>
+      </w:rPr>
+    </w:lvl>
+    <w:lvl w:ilvl="3" w:tplc="BAECA222">
+      <w:start w:val="1"/>
+      <w:numFmt w:val="bullet"/>
+      <w:lvlText w:val=""/>
+      <w:lvlJc w:val="left"/>
+      <w:pPr>
+        <w:ind w:left="2880" w:hanging="360"/>
+      </w:pPr>
+      <w:rPr>
+        <w:rFonts w:ascii="Symbol" w:hAnsi="Symbol" w:hint="default"/>
+      </w:rPr>
+    </w:lvl>
+    <w:lvl w:ilvl="4" w:tplc="7F16016C">
+      <w:start w:val="1"/>
+      <w:numFmt w:val="bullet"/>
+      <w:lvlText w:val="o"/>
+      <w:lvlJc w:val="left"/>
+      <w:pPr>
+        <w:ind w:left="3600" w:hanging="360"/>
+      </w:pPr>
+      <w:rPr>
+        <w:rFonts w:ascii="Courier New" w:hAnsi="Courier New" w:hint="default"/>
+      </w:rPr>
+    </w:lvl>
+    <w:lvl w:ilvl="5" w:tplc="D3806E7C">
+      <w:start w:val="1"/>
+      <w:numFmt w:val="bullet"/>
+      <w:lvlText w:val=""/>
+      <w:lvlJc w:val="left"/>
+      <w:pPr>
+        <w:ind w:left="4320" w:hanging="360"/>
+      </w:pPr>
+      <w:rPr>
+        <w:rFonts w:ascii="Wingdings" w:hAnsi="Wingdings" w:hint="default"/>
+      </w:rPr>
+    </w:lvl>
+    <w:lvl w:ilvl="6" w:tplc="2AC2D612">
+      <w:start w:val="1"/>
+      <w:numFmt w:val="bullet"/>
+      <w:lvlText w:val=""/>
+      <w:lvlJc w:val="left"/>
+      <w:pPr>
+        <w:ind w:left="5040" w:hanging="360"/>
+      </w:pPr>
+      <w:rPr>
+        <w:rFonts w:ascii="Symbol" w:hAnsi="Symbol" w:hint="default"/>
+      </w:rPr>
+    </w:lvl>
+    <w:lvl w:ilvl="7" w:tplc="1C647EBE">
+      <w:start w:val="1"/>
+      <w:numFmt w:val="bullet"/>
+      <w:lvlText w:val="o"/>
+      <w:lvlJc w:val="left"/>
+      <w:pPr>
+        <w:ind w:left="5760" w:hanging="360"/>
+      </w:pPr>
+      <w:rPr>
+        <w:rFonts w:ascii="Courier New" w:hAnsi="Courier New" w:hint="default"/>
+      </w:rPr>
+    </w:lvl>
+    <w:lvl w:ilvl="8" w:tplc="C666E56E">
+      <w:start w:val="1"/>
+      <w:numFmt w:val="bullet"/>
+      <w:lvlText w:val=""/>
+      <w:lvlJc w:val="left"/>
+      <w:pPr>
+        <w:ind w:left="6480" w:hanging="360"/>
+      </w:pPr>
+      <w:rPr>
+        <w:rFonts w:ascii="Wingdings" w:hAnsi="Wingdings" w:hint="default"/>
+      </w:rPr>
+    </w:lvl>
+  </w:abstractNum>
+  <w:abstractNum w:abstractNumId="1" w15:restartNumberingAfterBreak="0">
     <w:nsid w:val="02646EBE"/>
     <w:multiLevelType w:val="hybridMultilevel"/>
     <w:tmpl w:val="000E9AF4"/>
@@ -3998,7 +4793,7 @@
       </w:rPr>
     </w:lvl>
   </w:abstractNum>
-  <w:abstractNum w:abstractNumId="1" w15:restartNumberingAfterBreak="0">
+  <w:abstractNum w:abstractNumId="2" w15:restartNumberingAfterBreak="0">
     <w:nsid w:val="02BE6291"/>
     <w:multiLevelType w:val="hybridMultilevel"/>
     <w:tmpl w:val="657484D8"/>
@@ -4111,7 +4906,7 @@
       </w:rPr>
     </w:lvl>
   </w:abstractNum>
-  <w:abstractNum w:abstractNumId="2" w15:restartNumberingAfterBreak="0">
+  <w:abstractNum w:abstractNumId="3" w15:restartNumberingAfterBreak="0">
     <w:nsid w:val="0F0F6618"/>
     <w:multiLevelType w:val="hybridMultilevel"/>
     <w:tmpl w:val="E4BEE796"/>
@@ -4198,7 +4993,120 @@
       </w:pPr>
     </w:lvl>
   </w:abstractNum>
-  <w:abstractNum w:abstractNumId="3" w15:restartNumberingAfterBreak="0">
+  <w:abstractNum w:abstractNumId="4" w15:restartNumberingAfterBreak="0">
+    <w:nsid w:val="10D454D6"/>
+    <w:multiLevelType w:val="hybridMultilevel"/>
+    <w:tmpl w:val="FFFFFFFF"/>
+    <w:lvl w:ilvl="0" w:tplc="EBF824DE">
+      <w:start w:val="1"/>
+      <w:numFmt w:val="bullet"/>
+      <w:lvlText w:val="-"/>
+      <w:lvlJc w:val="left"/>
+      <w:pPr>
+        <w:ind w:left="720" w:hanging="360"/>
+      </w:pPr>
+      <w:rPr>
+        <w:rFonts w:ascii="Aptos" w:hAnsi="Aptos" w:hint="default"/>
+      </w:rPr>
+    </w:lvl>
+    <w:lvl w:ilvl="1" w:tplc="AFCA82D8">
+      <w:start w:val="1"/>
+      <w:numFmt w:val="bullet"/>
+      <w:lvlText w:val="o"/>
+      <w:lvlJc w:val="left"/>
+      <w:pPr>
+        <w:ind w:left="1440" w:hanging="360"/>
+      </w:pPr>
+      <w:rPr>
+        <w:rFonts w:ascii="Courier New" w:hAnsi="Courier New" w:hint="default"/>
+      </w:rPr>
+    </w:lvl>
+    <w:lvl w:ilvl="2" w:tplc="1C22B56C">
+      <w:start w:val="1"/>
+      <w:numFmt w:val="bullet"/>
+      <w:lvlText w:val=""/>
+      <w:lvlJc w:val="left"/>
+      <w:pPr>
+        <w:ind w:left="2160" w:hanging="360"/>
+      </w:pPr>
+      <w:rPr>
+        <w:rFonts w:ascii="Wingdings" w:hAnsi="Wingdings" w:hint="default"/>
+      </w:rPr>
+    </w:lvl>
+    <w:lvl w:ilvl="3" w:tplc="A172FAD2">
+      <w:start w:val="1"/>
+      <w:numFmt w:val="bullet"/>
+      <w:lvlText w:val=""/>
+      <w:lvlJc w:val="left"/>
+      <w:pPr>
+        <w:ind w:left="2880" w:hanging="360"/>
+      </w:pPr>
+      <w:rPr>
+        <w:rFonts w:ascii="Symbol" w:hAnsi="Symbol" w:hint="default"/>
+      </w:rPr>
+    </w:lvl>
+    <w:lvl w:ilvl="4" w:tplc="CCDE103C">
+      <w:start w:val="1"/>
+      <w:numFmt w:val="bullet"/>
+      <w:lvlText w:val="o"/>
+      <w:lvlJc w:val="left"/>
+      <w:pPr>
+        <w:ind w:left="3600" w:hanging="360"/>
+      </w:pPr>
+      <w:rPr>
+        <w:rFonts w:ascii="Courier New" w:hAnsi="Courier New" w:hint="default"/>
+      </w:rPr>
+    </w:lvl>
+    <w:lvl w:ilvl="5" w:tplc="32DC7148">
+      <w:start w:val="1"/>
+      <w:numFmt w:val="bullet"/>
+      <w:lvlText w:val=""/>
+      <w:lvlJc w:val="left"/>
+      <w:pPr>
+        <w:ind w:left="4320" w:hanging="360"/>
+      </w:pPr>
+      <w:rPr>
+        <w:rFonts w:ascii="Wingdings" w:hAnsi="Wingdings" w:hint="default"/>
+      </w:rPr>
+    </w:lvl>
+    <w:lvl w:ilvl="6" w:tplc="43DCD118">
+      <w:start w:val="1"/>
+      <w:numFmt w:val="bullet"/>
+      <w:lvlText w:val=""/>
+      <w:lvlJc w:val="left"/>
+      <w:pPr>
+        <w:ind w:left="5040" w:hanging="360"/>
+      </w:pPr>
+      <w:rPr>
+        <w:rFonts w:ascii="Symbol" w:hAnsi="Symbol" w:hint="default"/>
+      </w:rPr>
+    </w:lvl>
+    <w:lvl w:ilvl="7" w:tplc="1F30EC98">
+      <w:start w:val="1"/>
+      <w:numFmt w:val="bullet"/>
+      <w:lvlText w:val="o"/>
+      <w:lvlJc w:val="left"/>
+      <w:pPr>
+        <w:ind w:left="5760" w:hanging="360"/>
+      </w:pPr>
+      <w:rPr>
+        <w:rFonts w:ascii="Courier New" w:hAnsi="Courier New" w:hint="default"/>
+      </w:rPr>
+    </w:lvl>
+    <w:lvl w:ilvl="8" w:tplc="1E642F5A">
+      <w:start w:val="1"/>
+      <w:numFmt w:val="bullet"/>
+      <w:lvlText w:val=""/>
+      <w:lvlJc w:val="left"/>
+      <w:pPr>
+        <w:ind w:left="6480" w:hanging="360"/>
+      </w:pPr>
+      <w:rPr>
+        <w:rFonts w:ascii="Wingdings" w:hAnsi="Wingdings" w:hint="default"/>
+      </w:rPr>
+    </w:lvl>
+  </w:abstractNum>
+  <w:abstractNum w:abstractNumId="5" w15:restartNumberingAfterBreak="0">
     <w:nsid w:val="1482775B"/>
     <w:multiLevelType w:val="multilevel"/>
     <w:tmpl w:val="95B6E422"/>
@@ -4284,7 +5192,7 @@
       </w:pPr>
     </w:lvl>
   </w:abstractNum>
-  <w:abstractNum w:abstractNumId="4" w15:restartNumberingAfterBreak="0">
+  <w:abstractNum w:abstractNumId="6" w15:restartNumberingAfterBreak="0">
     <w:nsid w:val="1BD748D2"/>
     <w:multiLevelType w:val="hybridMultilevel"/>
     <w:tmpl w:val="9B2C70D6"/>
@@ -4370,7 +5278,7 @@
       </w:pPr>
     </w:lvl>
   </w:abstractNum>
-  <w:abstractNum w:abstractNumId="5" w15:restartNumberingAfterBreak="0">
+  <w:abstractNum w:abstractNumId="7" w15:restartNumberingAfterBreak="0">
     <w:nsid w:val="21AF67C2"/>
     <w:multiLevelType w:val="hybridMultilevel"/>
     <w:tmpl w:val="81840646"/>
@@ -4483,7 +5391,120 @@
       </w:rPr>
     </w:lvl>
   </w:abstractNum>
-  <w:abstractNum w:abstractNumId="6" w15:restartNumberingAfterBreak="0">
+  <w:abstractNum w:abstractNumId="8" w15:restartNumberingAfterBreak="0">
+    <w:nsid w:val="2C133279"/>
+    <w:multiLevelType w:val="hybridMultilevel"/>
+    <w:tmpl w:val="FFFFFFFF"/>
+    <w:lvl w:ilvl="0" w:tplc="B854FF48">
+      <w:start w:val="1"/>
+      <w:numFmt w:val="bullet"/>
+      <w:lvlText w:val="-"/>
+      <w:lvlJc w:val="left"/>
+      <w:pPr>
+        <w:ind w:left="720" w:hanging="360"/>
+      </w:pPr>
+      <w:rPr>
+        <w:rFonts w:ascii="Aptos" w:hAnsi="Aptos" w:hint="default"/>
+      </w:rPr>
+    </w:lvl>
+    <w:lvl w:ilvl="1" w:tplc="3468E36E">
+      <w:start w:val="1"/>
+      <w:numFmt w:val="bullet"/>
+      <w:lvlText w:val="o"/>
+      <w:lvlJc w:val="left"/>
+      <w:pPr>
+        <w:ind w:left="1440" w:hanging="360"/>
+      </w:pPr>
+      <w:rPr>
+        <w:rFonts w:ascii="Courier New" w:hAnsi="Courier New" w:hint="default"/>
+      </w:rPr>
+    </w:lvl>
+    <w:lvl w:ilvl="2" w:tplc="8DB27A46">
+      <w:start w:val="1"/>
+      <w:numFmt w:val="bullet"/>
+      <w:lvlText w:val=""/>
+      <w:lvlJc w:val="left"/>
+      <w:pPr>
+        <w:ind w:left="2160" w:hanging="360"/>
+      </w:pPr>
+      <w:rPr>
+        <w:rFonts w:ascii="Wingdings" w:hAnsi="Wingdings" w:hint="default"/>
+      </w:rPr>
+    </w:lvl>
+    <w:lvl w:ilvl="3" w:tplc="31028ADA">
+      <w:start w:val="1"/>
+      <w:numFmt w:val="bullet"/>
+      <w:lvlText w:val=""/>
+      <w:lvlJc w:val="left"/>
+      <w:pPr>
+        <w:ind w:left="2880" w:hanging="360"/>
+      </w:pPr>
+      <w:rPr>
+        <w:rFonts w:ascii="Symbol" w:hAnsi="Symbol" w:hint="default"/>
+      </w:rPr>
+    </w:lvl>
+    <w:lvl w:ilvl="4" w:tplc="62E439AA">
+      <w:start w:val="1"/>
+      <w:numFmt w:val="bullet"/>
+      <w:lvlText w:val="o"/>
+      <w:lvlJc w:val="left"/>
+      <w:pPr>
+        <w:ind w:left="3600" w:hanging="360"/>
+      </w:pPr>
+      <w:rPr>
+        <w:rFonts w:ascii="Courier New" w:hAnsi="Courier New" w:hint="default"/>
+      </w:rPr>
+    </w:lvl>
+    <w:lvl w:ilvl="5" w:tplc="A210E87E">
+      <w:start w:val="1"/>
+      <w:numFmt w:val="bullet"/>
+      <w:lvlText w:val=""/>
+      <w:lvlJc w:val="left"/>
+      <w:pPr>
+        <w:ind w:left="4320" w:hanging="360"/>
+      </w:pPr>
+      <w:rPr>
+        <w:rFonts w:ascii="Wingdings" w:hAnsi="Wingdings" w:hint="default"/>
+      </w:rPr>
+    </w:lvl>
+    <w:lvl w:ilvl="6" w:tplc="BCEE6BA2">
+      <w:start w:val="1"/>
+      <w:numFmt w:val="bullet"/>
+      <w:lvlText w:val=""/>
+      <w:lvlJc w:val="left"/>
+      <w:pPr>
+        <w:ind w:left="5040" w:hanging="360"/>
+      </w:pPr>
+      <w:rPr>
+        <w:rFonts w:ascii="Symbol" w:hAnsi="Symbol" w:hint="default"/>
+      </w:rPr>
+    </w:lvl>
+    <w:lvl w:ilvl="7" w:tplc="BAFCD980">
+      <w:start w:val="1"/>
+      <w:numFmt w:val="bullet"/>
+      <w:lvlText w:val="o"/>
+      <w:lvlJc w:val="left"/>
+      <w:pPr>
+        <w:ind w:left="5760" w:hanging="360"/>
+      </w:pPr>
+      <w:rPr>
+        <w:rFonts w:ascii="Courier New" w:hAnsi="Courier New" w:hint="default"/>
+      </w:rPr>
+    </w:lvl>
+    <w:lvl w:ilvl="8" w:tplc="84BED362">
+      <w:start w:val="1"/>
+      <w:numFmt w:val="bullet"/>
+      <w:lvlText w:val=""/>
+      <w:lvlJc w:val="left"/>
+      <w:pPr>
+        <w:ind w:left="6480" w:hanging="360"/>
+      </w:pPr>
+      <w:rPr>
+        <w:rFonts w:ascii="Wingdings" w:hAnsi="Wingdings" w:hint="default"/>
+      </w:rPr>
+    </w:lvl>
+  </w:abstractNum>
+  <w:abstractNum w:abstractNumId="9" w15:restartNumberingAfterBreak="0">
     <w:nsid w:val="3BFD2163"/>
     <w:multiLevelType w:val="hybridMultilevel"/>
     <w:tmpl w:val="DB6691FC"/>
@@ -4572,7 +5593,7 @@
       </w:pPr>
     </w:lvl>
   </w:abstractNum>
-  <w:abstractNum w:abstractNumId="7" w15:restartNumberingAfterBreak="0">
+  <w:abstractNum w:abstractNumId="10" w15:restartNumberingAfterBreak="0">
     <w:nsid w:val="442467D7"/>
     <w:multiLevelType w:val="hybridMultilevel"/>
     <w:tmpl w:val="FFFFFFFF"/>
@@ -4685,7 +5706,7 @@
       </w:rPr>
     </w:lvl>
   </w:abstractNum>
-  <w:abstractNum w:abstractNumId="8" w15:restartNumberingAfterBreak="0">
+  <w:abstractNum w:abstractNumId="11" w15:restartNumberingAfterBreak="0">
     <w:nsid w:val="446D4DDB"/>
     <w:multiLevelType w:val="hybridMultilevel"/>
     <w:tmpl w:val="0409001D"/>
@@ -4795,7 +5816,7 @@
       </w:rPr>
     </w:lvl>
   </w:abstractNum>
-  <w:abstractNum w:abstractNumId="9" w15:restartNumberingAfterBreak="0">
+  <w:abstractNum w:abstractNumId="12" w15:restartNumberingAfterBreak="0">
     <w:nsid w:val="49771054"/>
     <w:multiLevelType w:val="hybridMultilevel"/>
     <w:tmpl w:val="3892B1D0"/>
@@ -4882,7 +5903,7 @@
       </w:pPr>
     </w:lvl>
   </w:abstractNum>
-  <w:abstractNum w:abstractNumId="10" w15:restartNumberingAfterBreak="0">
+  <w:abstractNum w:abstractNumId="13" w15:restartNumberingAfterBreak="0">
     <w:nsid w:val="4AEA3C22"/>
     <w:multiLevelType w:val="hybridMultilevel"/>
     <w:tmpl w:val="3BDA76A2"/>
@@ -4968,7 +5989,7 @@
       </w:pPr>
     </w:lvl>
   </w:abstractNum>
-  <w:abstractNum w:abstractNumId="11" w15:restartNumberingAfterBreak="0">
+  <w:abstractNum w:abstractNumId="14" w15:restartNumberingAfterBreak="0">
     <w:nsid w:val="62E07DB4"/>
     <w:multiLevelType w:val="hybridMultilevel"/>
     <w:tmpl w:val="5B3ED38C"/>
@@ -5081,7 +6102,7 @@
       </w:rPr>
     </w:lvl>
   </w:abstractNum>
-  <w:abstractNum w:abstractNumId="12" w15:restartNumberingAfterBreak="0">
+  <w:abstractNum w:abstractNumId="15" w15:restartNumberingAfterBreak="0">
     <w:nsid w:val="72F204F4"/>
     <w:multiLevelType w:val="hybridMultilevel"/>
     <w:tmpl w:val="979A7680"/>
@@ -5170,7 +6191,7 @@
       </w:pPr>
     </w:lvl>
   </w:abstractNum>
-  <w:abstractNum w:abstractNumId="13" w15:restartNumberingAfterBreak="0">
+  <w:abstractNum w:abstractNumId="16" w15:restartNumberingAfterBreak="0">
     <w:nsid w:val="7A782887"/>
     <w:multiLevelType w:val="hybridMultilevel"/>
     <w:tmpl w:val="C1E297A4"/>
@@ -5256,7 +6277,7 @@
       </w:pPr>
     </w:lvl>
   </w:abstractNum>
-  <w:abstractNum w:abstractNumId="14" w15:restartNumberingAfterBreak="0">
+  <w:abstractNum w:abstractNumId="17" w15:restartNumberingAfterBreak="0">
     <w:nsid w:val="7B1B7BF6"/>
     <w:multiLevelType w:val="hybridMultilevel"/>
     <w:tmpl w:val="AB9875EE"/>
@@ -5369,7 +6390,7 @@
       </w:rPr>
     </w:lvl>
   </w:abstractNum>
-  <w:abstractNum w:abstractNumId="15" w15:restartNumberingAfterBreak="0">
+  <w:abstractNum w:abstractNumId="18" w15:restartNumberingAfterBreak="0">
     <w:nsid w:val="7D306817"/>
     <w:multiLevelType w:val="hybridMultilevel"/>
     <w:tmpl w:val="58E0050E"/>
@@ -5455,7 +6476,7 @@
       </w:pPr>
     </w:lvl>
   </w:abstractNum>
-  <w:abstractNum w:abstractNumId="16" w15:restartNumberingAfterBreak="0">
+  <w:abstractNum w:abstractNumId="19" w15:restartNumberingAfterBreak="0">
     <w:nsid w:val="7E932F65"/>
     <w:multiLevelType w:val="hybridMultilevel"/>
     <w:tmpl w:val="71241596"/>
@@ -5546,56 +6567,65 @@
       </w:pPr>
     </w:lvl>
   </w:abstractNum>
-  <w:num w:numId="1" w16cid:durableId="855770038">
+  <w:num w:numId="1" w16cid:durableId="1100876243">
+    <w:abstractNumId w:val="8"/>
+  </w:num>
+  <w:num w:numId="2" w16cid:durableId="1799833687">
+    <w:abstractNumId w:val="0"/>
+  </w:num>
+  <w:num w:numId="3" w16cid:durableId="81991879">
+    <w:abstractNumId w:val="4"/>
+  </w:num>
+  <w:num w:numId="4" w16cid:durableId="855770038">
+    <w:abstractNumId w:val="12"/>
+  </w:num>
+  <w:num w:numId="5" w16cid:durableId="253511886">
+    <w:abstractNumId w:val="7"/>
+  </w:num>
+  <w:num w:numId="6" w16cid:durableId="989022071">
+    <w:abstractNumId w:val="5"/>
+  </w:num>
+  <w:num w:numId="7" w16cid:durableId="936522140">
+    <w:abstractNumId w:val="15"/>
+  </w:num>
+  <w:num w:numId="8" w16cid:durableId="970944160">
+    <w:abstractNumId w:val="1"/>
+  </w:num>
+  <w:num w:numId="9" w16cid:durableId="1915436796">
+    <w:abstractNumId w:val="2"/>
+  </w:num>
+  <w:num w:numId="10" w16cid:durableId="222104892">
     <w:abstractNumId w:val="9"/>
   </w:num>
-  <w:num w:numId="2" w16cid:durableId="253511886">
-    <w:abstractNumId w:val="5"/>
-  </w:num>
-  <w:num w:numId="3" w16cid:durableId="989022071">
-    <w:abstractNumId w:val="3"/>
-  </w:num>
-  <w:num w:numId="4" w16cid:durableId="936522140">
-    <w:abstractNumId w:val="12"/>
-  </w:num>
-  <w:num w:numId="5" w16cid:durableId="970944160">
-    <w:abstractNumId w:val="0"/>
-  </w:num>
-  <w:num w:numId="6" w16cid:durableId="1915436796">
-    <w:abstractNumId w:val="1"/>
-  </w:num>
-  <w:num w:numId="7" w16cid:durableId="222104892">
+  <w:num w:numId="11" w16cid:durableId="984973022">
     <w:abstractNumId w:val="6"/>
   </w:num>
-  <w:num w:numId="8" w16cid:durableId="984973022">
-    <w:abstractNumId w:val="4"/>
+  <w:num w:numId="12" w16cid:durableId="1000276616">
+    <w:abstractNumId w:val="16"/>
   </w:num>
-  <w:num w:numId="9" w16cid:durableId="1000276616">
+  <w:num w:numId="13" w16cid:durableId="1336616761">
+    <w:abstractNumId w:val="18"/>
+  </w:num>
+  <w:num w:numId="14" w16cid:durableId="1321423920">
+    <w:abstractNumId w:val="11"/>
+  </w:num>
+  <w:num w:numId="15" w16cid:durableId="1240334457">
     <w:abstractNumId w:val="13"/>
   </w:num>
-  <w:num w:numId="10" w16cid:durableId="1336616761">
-    <w:abstractNumId w:val="15"/>
+  <w:num w:numId="16" w16cid:durableId="1395203716">
+    <w:abstractNumId w:val="19"/>
   </w:num>
-  <w:num w:numId="11" w16cid:durableId="1321423920">
-    <w:abstractNumId w:val="8"/>
+  <w:num w:numId="17" w16cid:durableId="2089955755">
+    <w:abstractNumId w:val="14"/>
   </w:num>
-  <w:num w:numId="12" w16cid:durableId="1240334457">
+  <w:num w:numId="18" w16cid:durableId="437717867">
     <w:abstractNumId w:val="10"/>
   </w:num>
-  <w:num w:numId="13" w16cid:durableId="1395203716">
-    <w:abstractNumId w:val="16"/>
+  <w:num w:numId="19" w16cid:durableId="2122525808">
+    <w:abstractNumId w:val="17"/>
   </w:num>
-  <w:num w:numId="14" w16cid:durableId="2089955755">
-    <w:abstractNumId w:val="11"/>
-  </w:num>
-  <w:num w:numId="15" w16cid:durableId="437717867">
-    <w:abstractNumId w:val="7"/>
-  </w:num>
-  <w:num w:numId="16" w16cid:durableId="2122525808">
-    <w:abstractNumId w:val="14"/>
-  </w:num>
-  <w:num w:numId="17" w16cid:durableId="368921081">
-    <w:abstractNumId w:val="2"/>
+  <w:num w:numId="20" w16cid:durableId="368921081">
+    <w:abstractNumId w:val="3"/>
   </w:num>
   <w:numIdMacAtCleanup w:val="8"/>
 </w:numbering>
@@ -6211,6 +7241,7 @@
   <w:style w:type="character" w:default="1" w:styleId="Fuentedeprrafopredeter">
     <w:name w:val="Default Paragraph Font"/>
     <w:uiPriority w:val="1"/>
+    <w:semiHidden/>
     <w:unhideWhenUsed/>
   </w:style>
   <w:style w:type="table" w:default="1" w:styleId="Tablanormal">
@@ -7646,19 +8677,54 @@
 </file>
 
 <file path=customXml/item1.xml><?xml version="1.0" encoding="utf-8"?>
-<?mso-contentType ?>
-<FormTemplates xmlns="http://schemas.microsoft.com/sharepoint/v3/contenttype/forms">
-  <Display>DocumentLibraryForm</Display>
-  <Edit>DocumentLibraryForm</Edit>
-  <New>DocumentLibraryForm</New>
-</FormTemplates>
+<p:properties xmlns:p="http://schemas.microsoft.com/office/2006/metadata/properties" xmlns:xsi="http://www.w3.org/2001/XMLSchema-instance" xmlns:pc="http://schemas.microsoft.com/office/infopath/2007/PartnerControls">
+  <documentManagement>
+    <SharedWithUsers xmlns="85e30bcc-d76c-4413-8e4d-2dce22fb0743">
+      <UserInfo>
+        <DisplayName>Dario Ernesto Correal Torres</DisplayName>
+        <AccountId>15</AccountId>
+        <AccountType/>
+      </UserInfo>
+      <UserInfo>
+        <DisplayName>Carlos Andres Lozano Garzon</DisplayName>
+        <AccountId>13</AccountId>
+        <AccountType/>
+      </UserInfo>
+      <UserInfo>
+        <DisplayName>Mario  Fernando De la rosa Rosero</DisplayName>
+        <AccountId>16</AccountId>
+        <AccountType/>
+      </UserInfo>
+      <UserInfo>
+        <DisplayName>Arturo Henao Chaparro</DisplayName>
+        <AccountId>48</AccountId>
+        <AccountType/>
+      </UserInfo>
+      <UserInfo>
+        <DisplayName>Luis Esteban Florez Salamanca</DisplayName>
+        <AccountId>33</AccountId>
+        <AccountType/>
+      </UserInfo>
+      <UserInfo>
+        <DisplayName>Christian Camilo Aparicio Baquen</DisplayName>
+        <AccountId>50</AccountId>
+        <AccountType/>
+      </UserInfo>
+      <UserInfo>
+        <DisplayName>Ivan David Salazar Cardenas</DisplayName>
+        <AccountId>52</AccountId>
+        <AccountType/>
+      </UserInfo>
+    </SharedWithUsers>
+    <TaxCatchAll xmlns="85e30bcc-d76c-4413-8e4d-2dce22fb0743" xsi:nil="true"/>
+    <lcf76f155ced4ddcb4097134ff3c332f xmlns="164883f8-7691-4ecf-b54a-664c0d0edefe">
+      <Terms xmlns="http://schemas.microsoft.com/office/infopath/2007/PartnerControls"/>
+    </lcf76f155ced4ddcb4097134ff3c332f>
+  </documentManagement>
+</p:properties>
 </file>
 
 <file path=customXml/item2.xml><?xml version="1.0" encoding="utf-8"?>
-<b:Sources xmlns:b="http://schemas.openxmlformats.org/officeDocument/2006/bibliography" xmlns="http://schemas.openxmlformats.org/officeDocument/2006/bibliography" SelectedStyle="\APASixthEditionOfficeOnline.xsl" StyleName="APA" Version="6"/>
-</file>
-
-<file path=customXml/item3.xml><?xml version="1.0" encoding="utf-8"?>
 <ct:contentTypeSchema xmlns:ct="http://schemas.microsoft.com/office/2006/metadata/contentType" xmlns:ma="http://schemas.microsoft.com/office/2006/metadata/properties/metaAttributes" ct:_="" ma:_="" ma:contentTypeName="Documento" ma:contentTypeID="0x01010023858CF01A2EF24688B692775F4C60A4" ma:contentTypeVersion="15" ma:contentTypeDescription="Crear nuevo documento." ma:contentTypeScope="" ma:versionID="a4df9e4b793c0fa050084ef4feafa589">
   <xsd:schema xmlns:xsd="http://www.w3.org/2001/XMLSchema" xmlns:xs="http://www.w3.org/2001/XMLSchema" xmlns:p="http://schemas.microsoft.com/office/2006/metadata/properties" xmlns:ns2="164883f8-7691-4ecf-b54a-664c0d0edefe" xmlns:ns3="85e30bcc-d76c-4413-8e4d-2dce22fb0743" targetNamespace="http://schemas.microsoft.com/office/2006/metadata/properties" ma:root="true" ma:fieldsID="067b7080d2289f9ba15465beea7d18a8" ns2:_="" ns3:_="">
     <xsd:import namespace="164883f8-7691-4ecf-b54a-664c0d0edefe"/>
@@ -7895,71 +8961,31 @@
 </ct:contentTypeSchema>
 </file>
 
+<file path=customXml/item3.xml><?xml version="1.0" encoding="utf-8"?>
+<b:Sources xmlns:b="http://schemas.openxmlformats.org/officeDocument/2006/bibliography" xmlns="http://schemas.openxmlformats.org/officeDocument/2006/bibliography" SelectedStyle="\APASixthEditionOfficeOnline.xsl" StyleName="APA" Version="6"/>
+</file>
+
 <file path=customXml/item4.xml><?xml version="1.0" encoding="utf-8"?>
-<p:properties xmlns:p="http://schemas.microsoft.com/office/2006/metadata/properties" xmlns:xsi="http://www.w3.org/2001/XMLSchema-instance" xmlns:pc="http://schemas.microsoft.com/office/infopath/2007/PartnerControls">
-  <documentManagement>
-    <SharedWithUsers xmlns="85e30bcc-d76c-4413-8e4d-2dce22fb0743">
-      <UserInfo>
-        <DisplayName>Dario Ernesto Correal Torres</DisplayName>
-        <AccountId>15</AccountId>
-        <AccountType/>
-      </UserInfo>
-      <UserInfo>
-        <DisplayName>Carlos Andres Lozano Garzon</DisplayName>
-        <AccountId>13</AccountId>
-        <AccountType/>
-      </UserInfo>
-      <UserInfo>
-        <DisplayName>Mario  Fernando De la rosa Rosero</DisplayName>
-        <AccountId>16</AccountId>
-        <AccountType/>
-      </UserInfo>
-      <UserInfo>
-        <DisplayName>Arturo Henao Chaparro</DisplayName>
-        <AccountId>48</AccountId>
-        <AccountType/>
-      </UserInfo>
-      <UserInfo>
-        <DisplayName>Luis Esteban Florez Salamanca</DisplayName>
-        <AccountId>33</AccountId>
-        <AccountType/>
-      </UserInfo>
-      <UserInfo>
-        <DisplayName>Christian Camilo Aparicio Baquen</DisplayName>
-        <AccountId>50</AccountId>
-        <AccountType/>
-      </UserInfo>
-      <UserInfo>
-        <DisplayName>Ivan David Salazar Cardenas</DisplayName>
-        <AccountId>52</AccountId>
-        <AccountType/>
-      </UserInfo>
-    </SharedWithUsers>
-    <TaxCatchAll xmlns="85e30bcc-d76c-4413-8e4d-2dce22fb0743" xsi:nil="true"/>
-    <lcf76f155ced4ddcb4097134ff3c332f xmlns="164883f8-7691-4ecf-b54a-664c0d0edefe">
-      <Terms xmlns="http://schemas.microsoft.com/office/infopath/2007/PartnerControls"/>
-    </lcf76f155ced4ddcb4097134ff3c332f>
-  </documentManagement>
-</p:properties>
+<?mso-contentType ?>
+<FormTemplates xmlns="http://schemas.microsoft.com/sharepoint/v3/contenttype/forms">
+  <Display>DocumentLibraryForm</Display>
+  <Edit>DocumentLibraryForm</Edit>
+  <New>DocumentLibraryForm</New>
+</FormTemplates>
 </file>
 
 <file path=customXml/itemProps1.xml><?xml version="1.0" encoding="utf-8"?>
-<ds:datastoreItem xmlns:ds="http://schemas.openxmlformats.org/officeDocument/2006/customXml" ds:itemID="{58AFF83A-2C1F-4B0C-9BCE-EE49F5226348}">
+<ds:datastoreItem xmlns:ds="http://schemas.openxmlformats.org/officeDocument/2006/customXml" ds:itemID="{D3B4676A-CA48-4E6B-BABE-1535A7A288F6}">
   <ds:schemaRefs>
-    <ds:schemaRef ds:uri="http://schemas.microsoft.com/sharepoint/v3/contenttype/forms"/>
+    <ds:schemaRef ds:uri="http://schemas.microsoft.com/office/2006/metadata/properties"/>
+    <ds:schemaRef ds:uri="http://schemas.microsoft.com/office/infopath/2007/PartnerControls"/>
+    <ds:schemaRef ds:uri="85e30bcc-d76c-4413-8e4d-2dce22fb0743"/>
+    <ds:schemaRef ds:uri="164883f8-7691-4ecf-b54a-664c0d0edefe"/>
   </ds:schemaRefs>
 </ds:datastoreItem>
 </file>
 
 <file path=customXml/itemProps2.xml><?xml version="1.0" encoding="utf-8"?>
-<ds:datastoreItem xmlns:ds="http://schemas.openxmlformats.org/officeDocument/2006/customXml" ds:itemID="{794BE61C-5254-4531-868C-EC2590174185}">
-  <ds:schemaRefs>
-    <ds:schemaRef ds:uri="http://schemas.openxmlformats.org/officeDocument/2006/bibliography"/>
-  </ds:schemaRefs>
-</ds:datastoreItem>
-</file>
-
-<file path=customXml/itemProps3.xml><?xml version="1.0" encoding="utf-8"?>
 <ds:datastoreItem xmlns:ds="http://schemas.openxmlformats.org/officeDocument/2006/customXml" ds:itemID="{62F3E371-4CEE-4871-A936-27DA1639FADD}">
   <ds:schemaRefs>
     <ds:schemaRef ds:uri="http://schemas.microsoft.com/office/2006/metadata/contentType"/>
@@ -7978,13 +9004,18 @@
 </ds:datastoreItem>
 </file>
 
+<file path=customXml/itemProps3.xml><?xml version="1.0" encoding="utf-8"?>
+<ds:datastoreItem xmlns:ds="http://schemas.openxmlformats.org/officeDocument/2006/customXml" ds:itemID="{794BE61C-5254-4531-868C-EC2590174185}">
+  <ds:schemaRefs>
+    <ds:schemaRef ds:uri="http://schemas.openxmlformats.org/officeDocument/2006/bibliography"/>
+  </ds:schemaRefs>
+</ds:datastoreItem>
+</file>
+
 <file path=customXml/itemProps4.xml><?xml version="1.0" encoding="utf-8"?>
-<ds:datastoreItem xmlns:ds="http://schemas.openxmlformats.org/officeDocument/2006/customXml" ds:itemID="{D3B4676A-CA48-4E6B-BABE-1535A7A288F6}">
+<ds:datastoreItem xmlns:ds="http://schemas.openxmlformats.org/officeDocument/2006/customXml" ds:itemID="{58AFF83A-2C1F-4B0C-9BCE-EE49F5226348}">
   <ds:schemaRefs>
-    <ds:schemaRef ds:uri="http://schemas.microsoft.com/office/2006/metadata/properties"/>
-    <ds:schemaRef ds:uri="http://schemas.microsoft.com/office/infopath/2007/PartnerControls"/>
-    <ds:schemaRef ds:uri="85e30bcc-d76c-4413-8e4d-2dce22fb0743"/>
-    <ds:schemaRef ds:uri="164883f8-7691-4ecf-b54a-664c0d0edefe"/>
+    <ds:schemaRef ds:uri="http://schemas.microsoft.com/sharepoint/v3/contenttype/forms"/>
   </ds:schemaRefs>
 </ds:datastoreItem>
 </file>
</xml_diff>